<commit_message>
Resume: all five portfolio repos, remove unsupported percentage claims
</commit_message>
<xml_diff>
--- a/Sai_Kumar_Reddy_Anthireddy_Resume.docx
+++ b/Sai_Kumar_Reddy_Anthireddy_Resume.docx
@@ -130,7 +130,7 @@
           <w:sz w:val="21"/>
           <w:szCs w:val="21"/>
         </w:rPr>
-        <w:t xml:space="preserve">AI/ML Engineer with 3 years of experience designing and deploying machine learning and Generative AI solutions for customer analytics and enterprise support automation. Expert in LLM-powered applications, Retrieval-Augmented Generation (RAG) pipelines, and semantic search using LangChain, Hugging Face, PyTorch, and OpenAI APIs. Proven record of shipping production AI on AWS SageMaker, Docker, and Kubernetes with full CI/CD and model monitoring — including a RAG platform that cut support ticket volume by 35%.</w:t>
+        <w:t xml:space="preserve">AI/ML Engineer with 3 years of experience designing and deploying machine learning and Generative AI solutions for customer analytics and enterprise support automation. Expert in LLM-powered applications, Retrieval-Augmented Generation (RAG) pipelines, and semantic search using LangChain, Hugging Face, PyTorch, and OpenAI APIs. Proven record of shipping production AI on AWS SageMaker, Docker, and Kubernetes with full CI/CD and model monitoring — including a RAG platform that now handles first-line technical support queries.</w:t>
       </w:r>
     </w:p>
     <w:p>
@@ -381,17 +381,7 @@
           <w:sz w:val="21"/>
           <w:szCs w:val="21"/>
         </w:rPr>
-        <w:t xml:space="preserve"> using RAG over enterprise knowledge sources, reducing support ticket volume by </w:t>
-      </w:r>
-      <w:r>
-        <w:rPr>
-          <w:rFonts w:ascii="Calibri" w:cs="Calibri" w:eastAsia="Calibri" w:hAnsi="Calibri"/>
-          <w:b/>
-          <w:bCs/>
-          <w:sz w:val="21"/>
-          <w:szCs w:val="21"/>
-        </w:rPr>
-        <w:t xml:space="preserve">35%</w:t>
+        <w:t xml:space="preserve"> using RAG over enterprise knowledge sources to automate first-line technical support</w:t>
       </w:r>
       <w:r>
         <w:rPr>
@@ -453,17 +443,7 @@
           <w:sz w:val="21"/>
           <w:szCs w:val="21"/>
         </w:rPr>
-        <w:t xml:space="preserve">Fine-tuned Hugging Face Transformer models (BERT) for intent classification, improving response accuracy by </w:t>
-      </w:r>
-      <w:r>
-        <w:rPr>
-          <w:rFonts w:ascii="Calibri" w:cs="Calibri" w:eastAsia="Calibri" w:hAnsi="Calibri"/>
-          <w:b/>
-          <w:bCs/>
-          <w:sz w:val="21"/>
-          <w:szCs w:val="21"/>
-        </w:rPr>
-        <w:t xml:space="preserve">18%</w:t>
+        <w:t xml:space="preserve">Fine-tuned Hugging Face Transformer models (BERT) for intent classification and technical query understanding, benchmarked against a keyword-matching baseline</w:t>
       </w:r>
       <w:r>
         <w:rPr>
@@ -489,25 +469,15 @@
           <w:sz w:val="21"/>
           <w:szCs w:val="21"/>
         </w:rPr>
-        <w:t xml:space="preserve">Improved semantic search relevance by </w:t>
-      </w:r>
-      <w:r>
-        <w:rPr>
-          <w:rFonts w:ascii="Calibri" w:cs="Calibri" w:eastAsia="Calibri" w:hAnsi="Calibri"/>
-          <w:b/>
-          <w:bCs/>
-          <w:sz w:val="21"/>
-          <w:szCs w:val="21"/>
-        </w:rPr>
-        <w:t xml:space="preserve">30%</w:t>
-      </w:r>
-      <w:r>
-        <w:rPr>
-          <w:rFonts w:ascii="Calibri" w:cs="Calibri" w:eastAsia="Calibri" w:hAnsi="Calibri"/>
-          <w:sz w:val="21"/>
-          <w:szCs w:val="21"/>
-        </w:rPr>
-        <w:t xml:space="preserve"> by managing vector embeddings in Pinecone and ChromaDB while reducing retrieval latency.</w:t>
+        <w:t xml:space="preserve">Tuned embedding and chunking strategy</w:t>
+      </w:r>
+      <w:r>
+        <w:rPr>
+          <w:rFonts w:ascii="Calibri" w:cs="Calibri" w:eastAsia="Calibri" w:hAnsi="Calibri"/>
+          <w:sz w:val="21"/>
+          <w:szCs w:val="21"/>
+        </w:rPr>
+        <w:t xml:space="preserve"> while managing vector embeddings in Pinecone and ChromaDB, improving retrieval relevance and cutting query latency.</w:t>
       </w:r>
     </w:p>
     <w:p>
@@ -579,17 +549,7 @@
           <w:sz w:val="21"/>
           <w:szCs w:val="21"/>
         </w:rPr>
-        <w:t xml:space="preserve">, cutting deployment time by </w:t>
-      </w:r>
-      <w:r>
-        <w:rPr>
-          <w:rFonts w:ascii="Calibri" w:cs="Calibri" w:eastAsia="Calibri" w:hAnsi="Calibri"/>
-          <w:b/>
-          <w:bCs/>
-          <w:sz w:val="21"/>
-          <w:szCs w:val="21"/>
-        </w:rPr>
-        <w:t xml:space="preserve">40%</w:t>
+        <w:t xml:space="preserve"> with autoscaling and health probes, replacing a manual release process</w:t>
       </w:r>
       <w:r>
         <w:rPr>
@@ -760,17 +720,7 @@
           <w:sz w:val="21"/>
           <w:szCs w:val="21"/>
         </w:rPr>
-        <w:t xml:space="preserve"> with Pandas and NumPy, improving data quality and cutting preprocessing time by </w:t>
-      </w:r>
-      <w:r>
-        <w:rPr>
-          <w:rFonts w:ascii="Calibri" w:cs="Calibri" w:eastAsia="Calibri" w:hAnsi="Calibri"/>
-          <w:b/>
-          <w:bCs/>
-          <w:sz w:val="21"/>
-          <w:szCs w:val="21"/>
-        </w:rPr>
-        <w:t xml:space="preserve">30%</w:t>
+        <w:t xml:space="preserve"> with Pandas and NumPy, improving data quality and automating a previously manual preprocessing step</w:t>
       </w:r>
       <w:r>
         <w:rPr>
@@ -814,17 +764,7 @@
           <w:sz w:val="21"/>
           <w:szCs w:val="21"/>
         </w:rPr>
-        <w:t xml:space="preserve">, improving churn prediction accuracy by </w:t>
-      </w:r>
-      <w:r>
-        <w:rPr>
-          <w:rFonts w:ascii="Calibri" w:cs="Calibri" w:eastAsia="Calibri" w:hAnsi="Calibri"/>
-          <w:b/>
-          <w:bCs/>
-          <w:sz w:val="21"/>
-          <w:szCs w:val="21"/>
-        </w:rPr>
-        <w:t xml:space="preserve">15%</w:t>
+        <w:t xml:space="preserve">, evaluated against the incumbent rules-based retention model</w:t>
       </w:r>
       <w:r>
         <w:rPr>
@@ -904,25 +844,15 @@
           <w:sz w:val="21"/>
           <w:szCs w:val="21"/>
         </w:rPr>
-        <w:t xml:space="preserve">, reducing inference response time by </w:t>
-      </w:r>
-      <w:r>
-        <w:rPr>
-          <w:rFonts w:ascii="Calibri" w:cs="Calibri" w:eastAsia="Calibri" w:hAnsi="Calibri"/>
-          <w:b/>
-          <w:bCs/>
-          <w:sz w:val="21"/>
-          <w:szCs w:val="21"/>
-        </w:rPr>
-        <w:t xml:space="preserve">20%</w:t>
-      </w:r>
-      <w:r>
-        <w:rPr>
-          <w:rFonts w:ascii="Calibri" w:cs="Calibri" w:eastAsia="Calibri" w:hAnsi="Calibri"/>
-          <w:sz w:val="21"/>
-          <w:szCs w:val="21"/>
-        </w:rPr>
-        <w:t xml:space="preserve"> and enabling real-time churn prediction.</w:t>
+        <w:t xml:space="preserve">, enabling real-time churn scoring in place of a nightly batch job</w:t>
+      </w:r>
+      <w:r>
+        <w:rPr>
+          <w:rFonts w:ascii="Calibri" w:cs="Calibri" w:eastAsia="Calibri" w:hAnsi="Calibri"/>
+          <w:sz w:val="21"/>
+          <w:szCs w:val="21"/>
+        </w:rPr>
+        <w:t xml:space="preserve">.</w:t>
       </w:r>
     </w:p>
     <w:p>
@@ -947,7 +877,60 @@
     </w:p>
     <w:p>
       <w:pPr>
-        <w:spacing w:after="20" w:before="40"/>
+        <w:pStyle w:val="ListParagraph"/>
+        <w:numPr>
+          <w:ilvl w:val="0"/>
+          <w:numId w:val="2"/>
+        </w:numPr>
+        <w:spacing w:after="40"/>
+      </w:pPr>
+      <w:r>
+        <w:rPr>
+          <w:rFonts w:ascii="Calibri" w:cs="Calibri" w:eastAsia="Calibri" w:hAnsi="Calibri"/>
+          <w:b/>
+          <w:bCs/>
+          <w:sz w:val="21"/>
+          <w:szCs w:val="21"/>
+        </w:rPr>
+        <w:t xml:space="preserve">Enterprise AI Platform</w:t>
+      </w:r>
+      <w:r>
+        <w:rPr>
+          <w:rFonts w:ascii="Calibri" w:cs="Calibri" w:eastAsia="Calibri" w:hAnsi="Calibri"/>
+          <w:sz w:val="21"/>
+          <w:szCs w:val="21"/>
+        </w:rPr>
+        <w:t xml:space="preserve">  —  </w:t>
+      </w:r>
+      <w:hyperlink w:history="1" r:id="rIdproj_eai">
+        <w:r>
+          <w:rPr>
+            <w:rFonts w:ascii="Calibri" w:cs="Calibri" w:eastAsia="Calibri" w:hAnsi="Calibri"/>
+            <w:color w:val="0563C1"/>
+            <w:sz w:val="21"/>
+            <w:szCs w:val="21"/>
+            <w:u w:val="single"/>
+          </w:rPr>
+          <w:t xml:space="preserve">github.com/saianthireddy/enterprise-ai-platform</w:t>
+        </w:r>
+      </w:hyperlink>
+      <w:r>
+        <w:rPr>
+          <w:rFonts w:ascii="Calibri" w:cs="Calibri" w:eastAsia="Calibri" w:hAnsi="Calibri"/>
+          <w:sz w:val="21"/>
+          <w:szCs w:val="21"/>
+        </w:rPr>
+        <w:t xml:space="preserve">  —  Full-stack AI copilot: intent router over six task handlers, hybrid search, admin analytics, Next.js frontend, Terraform and Kubernetes infrastructure, 45 automated tests.</w:t>
+      </w:r>
+    </w:p>
+    <w:p>
+      <w:pPr>
+        <w:pStyle w:val="ListParagraph"/>
+        <w:numPr>
+          <w:ilvl w:val="0"/>
+          <w:numId w:val="2"/>
+        </w:numPr>
+        <w:spacing w:after="40"/>
       </w:pPr>
       <w:r>
         <w:rPr>
@@ -979,28 +962,119 @@
           <w:t xml:space="preserve">github.com/saianthireddy/rag-support-automation</w:t>
         </w:r>
       </w:hyperlink>
-    </w:p>
-    <w:p>
-      <w:pPr>
-        <w:pStyle w:val="ListParagraph"/>
-        <w:numPr>
-          <w:ilvl w:val="0"/>
-          <w:numId w:val="2"/>
-        </w:numPr>
-        <w:spacing w:after="30"/>
-      </w:pPr>
-      <w:r>
-        <w:rPr>
-          <w:rFonts w:ascii="Calibri" w:cs="Calibri" w:eastAsia="Calibri" w:hAnsi="Calibri"/>
-          <w:sz w:val="21"/>
-          <w:szCs w:val="21"/>
-        </w:rPr>
-        <w:t xml:space="preserve">Production-style RAG platform: document ingestion and chunking, swappable FAISS/Pinecone vector stores, citation-grounded generation, FastAPI service, Docker, and CI with 14 automated tests.</w:t>
-      </w:r>
-    </w:p>
-    <w:p>
-      <w:pPr>
-        <w:spacing w:after="20" w:before="60"/>
+      <w:r>
+        <w:rPr>
+          <w:rFonts w:ascii="Calibri" w:cs="Calibri" w:eastAsia="Calibri" w:hAnsi="Calibri"/>
+          <w:sz w:val="21"/>
+          <w:szCs w:val="21"/>
+        </w:rPr>
+        <w:t xml:space="preserve">  —  Production-style RAG platform: ingestion and chunking, swappable FAISS/Pinecone stores, citation-grounded generation, FastAPI, Docker, and a published retrieval benchmark.</w:t>
+      </w:r>
+    </w:p>
+    <w:p>
+      <w:pPr>
+        <w:pStyle w:val="ListParagraph"/>
+        <w:numPr>
+          <w:ilvl w:val="0"/>
+          <w:numId w:val="2"/>
+        </w:numPr>
+        <w:spacing w:after="40"/>
+      </w:pPr>
+      <w:r>
+        <w:rPr>
+          <w:rFonts w:ascii="Calibri" w:cs="Calibri" w:eastAsia="Calibri" w:hAnsi="Calibri"/>
+          <w:b/>
+          <w:bCs/>
+          <w:sz w:val="21"/>
+          <w:szCs w:val="21"/>
+        </w:rPr>
+        <w:t xml:space="preserve">Enterprise MLOps Platform</w:t>
+      </w:r>
+      <w:r>
+        <w:rPr>
+          <w:rFonts w:ascii="Calibri" w:cs="Calibri" w:eastAsia="Calibri" w:hAnsi="Calibri"/>
+          <w:sz w:val="21"/>
+          <w:szCs w:val="21"/>
+        </w:rPr>
+        <w:t xml:space="preserve">  —  </w:t>
+      </w:r>
+      <w:hyperlink w:history="1" r:id="rIdproj_emlops">
+        <w:r>
+          <w:rPr>
+            <w:rFonts w:ascii="Calibri" w:cs="Calibri" w:eastAsia="Calibri" w:hAnsi="Calibri"/>
+            <w:color w:val="0563C1"/>
+            <w:sz w:val="21"/>
+            <w:szCs w:val="21"/>
+            <w:u w:val="single"/>
+          </w:rPr>
+          <w:t xml:space="preserve">github.com/saianthireddy/enterprise-mlops-platform</w:t>
+        </w:r>
+      </w:hyperlink>
+      <w:r>
+        <w:rPr>
+          <w:rFonts w:ascii="Calibri" w:cs="Calibri" w:eastAsia="Calibri" w:hAnsi="Calibri"/>
+          <w:sz w:val="21"/>
+          <w:szCs w:val="21"/>
+        </w:rPr>
+        <w:t xml:space="preserve">  —  Model lifecycle from commit to monitored endpoint: champion/challenger promotion, versioned registry, PSI/KS drift detection, Kubernetes and SageMaker deployment.</w:t>
+      </w:r>
+    </w:p>
+    <w:p>
+      <w:pPr>
+        <w:pStyle w:val="ListParagraph"/>
+        <w:numPr>
+          <w:ilvl w:val="0"/>
+          <w:numId w:val="2"/>
+        </w:numPr>
+        <w:spacing w:after="40"/>
+      </w:pPr>
+      <w:r>
+        <w:rPr>
+          <w:rFonts w:ascii="Calibri" w:cs="Calibri" w:eastAsia="Calibri" w:hAnsi="Calibri"/>
+          <w:b/>
+          <w:bCs/>
+          <w:sz w:val="21"/>
+          <w:szCs w:val="21"/>
+        </w:rPr>
+        <w:t xml:space="preserve">webdocs-mcp</w:t>
+      </w:r>
+      <w:r>
+        <w:rPr>
+          <w:rFonts w:ascii="Calibri" w:cs="Calibri" w:eastAsia="Calibri" w:hAnsi="Calibri"/>
+          <w:sz w:val="21"/>
+          <w:szCs w:val="21"/>
+        </w:rPr>
+        <w:t xml:space="preserve">  —  </w:t>
+      </w:r>
+      <w:hyperlink w:history="1" r:id="rIdproj_webdocs">
+        <w:r>
+          <w:rPr>
+            <w:rFonts w:ascii="Calibri" w:cs="Calibri" w:eastAsia="Calibri" w:hAnsi="Calibri"/>
+            <w:color w:val="0563C1"/>
+            <w:sz w:val="21"/>
+            <w:szCs w:val="21"/>
+            <w:u w:val="single"/>
+          </w:rPr>
+          <w:t xml:space="preserve">github.com/saianthireddy/webdocs-mcp</w:t>
+        </w:r>
+      </w:hyperlink>
+      <w:r>
+        <w:rPr>
+          <w:rFonts w:ascii="Calibri" w:cs="Calibri" w:eastAsia="Calibri" w:hAnsi="Calibri"/>
+          <w:sz w:val="21"/>
+          <w:szCs w:val="21"/>
+        </w:rPr>
+        <w:t xml:space="preserve">  —  Documentation crawler with hybrid BM25 and embedding search over DuckDB, served to LLM agents as an MCP server.</w:t>
+      </w:r>
+    </w:p>
+    <w:p>
+      <w:pPr>
+        <w:pStyle w:val="ListParagraph"/>
+        <w:numPr>
+          <w:ilvl w:val="0"/>
+          <w:numId w:val="2"/>
+        </w:numPr>
+        <w:spacing w:after="40"/>
       </w:pPr>
       <w:r>
         <w:rPr>
@@ -1032,23 +1106,13 @@
           <w:t xml:space="preserve">github.com/saianthireddy/customer-churn-prediction</w:t>
         </w:r>
       </w:hyperlink>
-    </w:p>
-    <w:p>
-      <w:pPr>
-        <w:pStyle w:val="ListParagraph"/>
-        <w:numPr>
-          <w:ilvl w:val="0"/>
-          <w:numId w:val="2"/>
-        </w:numPr>
-        <w:spacing w:after="30"/>
-      </w:pPr>
-      <w:r>
-        <w:rPr>
-          <w:rFonts w:ascii="Calibri" w:cs="Calibri" w:eastAsia="Calibri" w:hAnsi="Calibri"/>
-          <w:sz w:val="21"/>
-          <w:szCs w:val="21"/>
-        </w:rPr>
-        <w:t xml:space="preserve">End-to-end churn ML system: data validation, feature engineering, Logistic Regression / Gradient Boosting pipelines, cross-validated evaluation, and a real-time /predict API with risk bands.</w:t>
+      <w:r>
+        <w:rPr>
+          <w:rFonts w:ascii="Calibri" w:cs="Calibri" w:eastAsia="Calibri" w:hAnsi="Calibri"/>
+          <w:sz w:val="21"/>
+          <w:szCs w:val="21"/>
+        </w:rPr>
+        <w:t xml:space="preserve">  —  End-to-end churn ML: data validation, feature engineering, Logistic Regression / Gradient Boosting pipelines, cross-validated evaluation, and a real-time /predict API with risk bands.</w:t>
       </w:r>
     </w:p>
     <w:p>

</xml_diff>

<commit_message>
Resume: compress to one page
</commit_message>
<xml_diff>
--- a/Sai_Kumar_Reddy_Anthireddy_Resume.docx
+++ b/Sai_Kumar_Reddy_Anthireddy_Resume.docx
@@ -42,8 +42,8 @@
       <w:r>
         <w:rPr>
           <w:rFonts w:ascii="Calibri" w:cs="Calibri" w:eastAsia="Calibri" w:hAnsi="Calibri"/>
-          <w:sz w:val="21"/>
-          <w:szCs w:val="21"/>
+          <w:sz w:val="20"/>
+          <w:szCs w:val="20"/>
         </w:rPr>
         <w:t xml:space="preserve">Dallas, TX  |  +1 (972) 710-9106  |  </w:t>
       </w:r>
@@ -52,8 +52,8 @@
           <w:rPr>
             <w:rFonts w:ascii="Calibri" w:cs="Calibri" w:eastAsia="Calibri" w:hAnsi="Calibri"/>
             <w:color w:val="0563C1"/>
-            <w:sz w:val="21"/>
-            <w:szCs w:val="21"/>
+            <w:sz w:val="20"/>
+            <w:szCs w:val="20"/>
             <w:u w:val="single"/>
           </w:rPr>
           <w:t xml:space="preserve">reddysaikumar614@gmail.com</w:t>
@@ -62,8 +62,8 @@
       <w:r>
         <w:rPr>
           <w:rFonts w:ascii="Calibri" w:cs="Calibri" w:eastAsia="Calibri" w:hAnsi="Calibri"/>
-          <w:sz w:val="21"/>
-          <w:szCs w:val="21"/>
+          <w:sz w:val="20"/>
+          <w:szCs w:val="20"/>
         </w:rPr>
         <w:t xml:space="preserve">  |  </w:t>
       </w:r>
@@ -72,8 +72,8 @@
           <w:rPr>
             <w:rFonts w:ascii="Calibri" w:cs="Calibri" w:eastAsia="Calibri" w:hAnsi="Calibri"/>
             <w:color w:val="0563C1"/>
-            <w:sz w:val="21"/>
-            <w:szCs w:val="21"/>
+            <w:sz w:val="20"/>
+            <w:szCs w:val="20"/>
             <w:u w:val="single"/>
           </w:rPr>
           <w:t xml:space="preserve">linkedin.com/in/saireddy2110</w:t>
@@ -82,8 +82,8 @@
       <w:r>
         <w:rPr>
           <w:rFonts w:ascii="Calibri" w:cs="Calibri" w:eastAsia="Calibri" w:hAnsi="Calibri"/>
-          <w:sz w:val="21"/>
-          <w:szCs w:val="21"/>
+          <w:sz w:val="20"/>
+          <w:szCs w:val="20"/>
         </w:rPr>
         <w:t xml:space="preserve">  |  </w:t>
       </w:r>
@@ -92,8 +92,8 @@
           <w:rPr>
             <w:rFonts w:ascii="Calibri" w:cs="Calibri" w:eastAsia="Calibri" w:hAnsi="Calibri"/>
             <w:color w:val="0563C1"/>
-            <w:sz w:val="21"/>
-            <w:szCs w:val="21"/>
+            <w:sz w:val="20"/>
+            <w:szCs w:val="20"/>
             <w:u w:val="single"/>
           </w:rPr>
           <w:t xml:space="preserve">github.com/saianthireddy</w:t>
@@ -127,10 +127,10 @@
       <w:r>
         <w:rPr>
           <w:rFonts w:ascii="Calibri" w:cs="Calibri" w:eastAsia="Calibri" w:hAnsi="Calibri"/>
-          <w:sz w:val="21"/>
-          <w:szCs w:val="21"/>
-        </w:rPr>
-        <w:t xml:space="preserve">AI/ML Engineer with 3 years of experience designing and deploying machine learning and Generative AI solutions for customer analytics and enterprise support automation. Expert in LLM-powered applications, Retrieval-Augmented Generation (RAG) pipelines, and semantic search using LangChain, Hugging Face, PyTorch, and OpenAI APIs. Proven record of shipping production AI on AWS SageMaker, Docker, and Kubernetes with full CI/CD and model monitoring — including a RAG platform that now handles first-line technical support queries.</w:t>
+          <w:sz w:val="20"/>
+          <w:szCs w:val="20"/>
+        </w:rPr>
+        <w:t xml:space="preserve">AI/ML Engineer with 3 years of experience building production LLM systems — RAG pipelines, semantic search, and fine-tuned Transformers with LangChain, Hugging Face, PyTorch, and OpenAI APIs. Ships end to end: retrieval architecture and prompt design through containerized deployment on Kubernetes and SageMaker, CI/CD, and model monitoring.</w:t>
       </w:r>
     </w:p>
     <w:p>
@@ -162,16 +162,16 @@
           <w:rFonts w:ascii="Calibri" w:cs="Calibri" w:eastAsia="Calibri" w:hAnsi="Calibri"/>
           <w:b/>
           <w:bCs/>
-          <w:sz w:val="21"/>
-          <w:szCs w:val="21"/>
-        </w:rPr>
-        <w:t xml:space="preserve">Generative AI &amp; LLMs: </w:t>
-      </w:r>
-      <w:r>
-        <w:rPr>
-          <w:rFonts w:ascii="Calibri" w:cs="Calibri" w:eastAsia="Calibri" w:hAnsi="Calibri"/>
-          <w:sz w:val="21"/>
-          <w:szCs w:val="21"/>
+          <w:sz w:val="20"/>
+          <w:szCs w:val="20"/>
+        </w:rPr>
+        <w:t xml:space="preserve">GenAI &amp; LLMs: </w:t>
+      </w:r>
+      <w:r>
+        <w:rPr>
+          <w:rFonts w:ascii="Calibri" w:cs="Calibri" w:eastAsia="Calibri" w:hAnsi="Calibri"/>
+          <w:sz w:val="20"/>
+          <w:szCs w:val="20"/>
         </w:rPr>
         <w:t xml:space="preserve">LangChain, Hugging Face Transformers, RAG, Prompt Engineering, OpenAI API, LlamaIndex, LangGraph, AI Agents</w:t>
       </w:r>
@@ -185,18 +185,18 @@
           <w:rFonts w:ascii="Calibri" w:cs="Calibri" w:eastAsia="Calibri" w:hAnsi="Calibri"/>
           <w:b/>
           <w:bCs/>
-          <w:sz w:val="21"/>
-          <w:szCs w:val="21"/>
-        </w:rPr>
-        <w:t xml:space="preserve">ML &amp; Deep Learning: </w:t>
-      </w:r>
-      <w:r>
-        <w:rPr>
-          <w:rFonts w:ascii="Calibri" w:cs="Calibri" w:eastAsia="Calibri" w:hAnsi="Calibri"/>
-          <w:sz w:val="21"/>
-          <w:szCs w:val="21"/>
-        </w:rPr>
-        <w:t xml:space="preserve">PyTorch, TensorFlow, Scikit-learn, Keras, CNNs, RNNs, Transformers, Transfer Learning</w:t>
+          <w:sz w:val="20"/>
+          <w:szCs w:val="20"/>
+        </w:rPr>
+        <w:t xml:space="preserve">ML, DL &amp; NLP: </w:t>
+      </w:r>
+      <w:r>
+        <w:rPr>
+          <w:rFonts w:ascii="Calibri" w:cs="Calibri" w:eastAsia="Calibri" w:hAnsi="Calibri"/>
+          <w:sz w:val="20"/>
+          <w:szCs w:val="20"/>
+        </w:rPr>
+        <w:t xml:space="preserve">PyTorch, TensorFlow, Scikit-learn, Keras, CNNs, RNNs, Transformers, Transfer Learning, BERT, spaCy, Text Classification, Embedding Models, Semantic Search</w:t>
       </w:r>
     </w:p>
     <w:p>
@@ -208,18 +208,18 @@
           <w:rFonts w:ascii="Calibri" w:cs="Calibri" w:eastAsia="Calibri" w:hAnsi="Calibri"/>
           <w:b/>
           <w:bCs/>
-          <w:sz w:val="21"/>
-          <w:szCs w:val="21"/>
-        </w:rPr>
-        <w:t xml:space="preserve">NLP: </w:t>
-      </w:r>
-      <w:r>
-        <w:rPr>
-          <w:rFonts w:ascii="Calibri" w:cs="Calibri" w:eastAsia="Calibri" w:hAnsi="Calibri"/>
-          <w:sz w:val="21"/>
-          <w:szCs w:val="21"/>
-        </w:rPr>
-        <w:t xml:space="preserve">BERT, spaCy, Text Classification, Sentiment Analysis, Embedding Models, Semantic Search</w:t>
+          <w:sz w:val="20"/>
+          <w:szCs w:val="20"/>
+        </w:rPr>
+        <w:t xml:space="preserve">MLOps &amp; Vector DBs: </w:t>
+      </w:r>
+      <w:r>
+        <w:rPr>
+          <w:rFonts w:ascii="Calibri" w:cs="Calibri" w:eastAsia="Calibri" w:hAnsi="Calibri"/>
+          <w:sz w:val="20"/>
+          <w:szCs w:val="20"/>
+        </w:rPr>
+        <w:t xml:space="preserve">Docker, Kubernetes, MLflow, FastAPI, REST APIs, GitHub Actions, CI/CD, Model Monitoring, Pinecone, FAISS, ChromaDB</w:t>
       </w:r>
     </w:p>
     <w:p>
@@ -231,62 +231,16 @@
           <w:rFonts w:ascii="Calibri" w:cs="Calibri" w:eastAsia="Calibri" w:hAnsi="Calibri"/>
           <w:b/>
           <w:bCs/>
-          <w:sz w:val="21"/>
-          <w:szCs w:val="21"/>
-        </w:rPr>
-        <w:t xml:space="preserve">Vector Databases: </w:t>
-      </w:r>
-      <w:r>
-        <w:rPr>
-          <w:rFonts w:ascii="Calibri" w:cs="Calibri" w:eastAsia="Calibri" w:hAnsi="Calibri"/>
-          <w:sz w:val="21"/>
-          <w:szCs w:val="21"/>
-        </w:rPr>
-        <w:t xml:space="preserve">Pinecone, FAISS, ChromaDB</w:t>
-      </w:r>
-    </w:p>
-    <w:p>
-      <w:pPr>
-        <w:spacing w:after="20"/>
-      </w:pPr>
-      <w:r>
-        <w:rPr>
-          <w:rFonts w:ascii="Calibri" w:cs="Calibri" w:eastAsia="Calibri" w:hAnsi="Calibri"/>
-          <w:b/>
-          <w:bCs/>
-          <w:sz w:val="21"/>
-          <w:szCs w:val="21"/>
-        </w:rPr>
-        <w:t xml:space="preserve">MLOps &amp; Deployment: </w:t>
-      </w:r>
-      <w:r>
-        <w:rPr>
-          <w:rFonts w:ascii="Calibri" w:cs="Calibri" w:eastAsia="Calibri" w:hAnsi="Calibri"/>
-          <w:sz w:val="21"/>
-          <w:szCs w:val="21"/>
-        </w:rPr>
-        <w:t xml:space="preserve">Docker, Kubernetes, MLflow, FastAPI, REST APIs, GitHub Actions, CI/CD, Model Monitoring</w:t>
-      </w:r>
-    </w:p>
-    <w:p>
-      <w:pPr>
-        <w:spacing w:after="20"/>
-      </w:pPr>
-      <w:r>
-        <w:rPr>
-          <w:rFonts w:ascii="Calibri" w:cs="Calibri" w:eastAsia="Calibri" w:hAnsi="Calibri"/>
-          <w:b/>
-          <w:bCs/>
-          <w:sz w:val="21"/>
-          <w:szCs w:val="21"/>
+          <w:sz w:val="20"/>
+          <w:szCs w:val="20"/>
         </w:rPr>
         <w:t xml:space="preserve">Cloud &amp; Data: </w:t>
       </w:r>
       <w:r>
         <w:rPr>
           <w:rFonts w:ascii="Calibri" w:cs="Calibri" w:eastAsia="Calibri" w:hAnsi="Calibri"/>
-          <w:sz w:val="21"/>
-          <w:szCs w:val="21"/>
+          <w:sz w:val="20"/>
+          <w:szCs w:val="20"/>
         </w:rPr>
         <w:t xml:space="preserve">AWS SageMaker, Azure, GCP, Pandas, NumPy, ETL Pipelines, Feature Engineering, SQL, Python, Java</w:t>
       </w:r>
@@ -342,8 +296,8 @@
           <w:b/>
           <w:bCs/>
           <w:color w:val="595959"/>
-          <w:sz w:val="21"/>
-          <w:szCs w:val="21"/>
+          <w:sz w:val="20"/>
+          <w:szCs w:val="20"/>
         </w:rPr>
         <w:t xml:space="preserve">	Jul 2025 – Present</w:t>
       </w:r>
@@ -360,8 +314,8 @@
       <w:r>
         <w:rPr>
           <w:rFonts w:ascii="Calibri" w:cs="Calibri" w:eastAsia="Calibri" w:hAnsi="Calibri"/>
-          <w:sz w:val="21"/>
-          <w:szCs w:val="21"/>
+          <w:sz w:val="20"/>
+          <w:szCs w:val="20"/>
         </w:rPr>
         <w:t xml:space="preserve">Designed an </w:t>
       </w:r>
@@ -370,24 +324,24 @@
           <w:rFonts w:ascii="Calibri" w:cs="Calibri" w:eastAsia="Calibri" w:hAnsi="Calibri"/>
           <w:b/>
           <w:bCs/>
-          <w:sz w:val="21"/>
-          <w:szCs w:val="21"/>
+          <w:sz w:val="20"/>
+          <w:szCs w:val="20"/>
         </w:rPr>
         <w:t xml:space="preserve">Intelligent Technical Knowledge &amp; Support Automation Platform</w:t>
       </w:r>
       <w:r>
         <w:rPr>
           <w:rFonts w:ascii="Calibri" w:cs="Calibri" w:eastAsia="Calibri" w:hAnsi="Calibri"/>
-          <w:sz w:val="21"/>
-          <w:szCs w:val="21"/>
+          <w:sz w:val="20"/>
+          <w:szCs w:val="20"/>
         </w:rPr>
         <w:t xml:space="preserve"> using RAG over enterprise knowledge sources to automate first-line technical support</w:t>
       </w:r>
       <w:r>
         <w:rPr>
           <w:rFonts w:ascii="Calibri" w:cs="Calibri" w:eastAsia="Calibri" w:hAnsi="Calibri"/>
-          <w:sz w:val="21"/>
-          <w:szCs w:val="21"/>
+          <w:sz w:val="20"/>
+          <w:szCs w:val="20"/>
         </w:rPr>
         <w:t xml:space="preserve">.</w:t>
       </w:r>
@@ -404,8 +358,8 @@
       <w:r>
         <w:rPr>
           <w:rFonts w:ascii="Calibri" w:cs="Calibri" w:eastAsia="Calibri" w:hAnsi="Calibri"/>
-          <w:sz w:val="21"/>
-          <w:szCs w:val="21"/>
+          <w:sz w:val="20"/>
+          <w:szCs w:val="20"/>
         </w:rPr>
         <w:t xml:space="preserve">Built an end-to-end RAG pipeline with </w:t>
       </w:r>
@@ -414,18 +368,18 @@
           <w:rFonts w:ascii="Calibri" w:cs="Calibri" w:eastAsia="Calibri" w:hAnsi="Calibri"/>
           <w:b/>
           <w:bCs/>
-          <w:sz w:val="21"/>
-          <w:szCs w:val="21"/>
+          <w:sz w:val="20"/>
+          <w:szCs w:val="20"/>
         </w:rPr>
         <w:t xml:space="preserve">LangChain, OpenAI API, FAISS, and Pinecone</w:t>
       </w:r>
       <w:r>
         <w:rPr>
           <w:rFonts w:ascii="Calibri" w:cs="Calibri" w:eastAsia="Calibri" w:hAnsi="Calibri"/>
-          <w:sz w:val="21"/>
-          <w:szCs w:val="21"/>
-        </w:rPr>
-        <w:t xml:space="preserve"> to retrieve, rank, and generate context-aware answers from manuals, SOPs, and support docs.</w:t>
+          <w:sz w:val="20"/>
+          <w:szCs w:val="20"/>
+        </w:rPr>
+        <w:t xml:space="preserve"> over manuals, SOPs, and support docs; tuned chunking and embedding across Pinecone and ChromaDB to improve retrieval relevance and latency.</w:t>
       </w:r>
     </w:p>
     <w:p>
@@ -440,16 +394,16 @@
       <w:r>
         <w:rPr>
           <w:rFonts w:ascii="Calibri" w:cs="Calibri" w:eastAsia="Calibri" w:hAnsi="Calibri"/>
-          <w:sz w:val="21"/>
-          <w:szCs w:val="21"/>
-        </w:rPr>
-        <w:t xml:space="preserve">Fine-tuned Hugging Face Transformer models (BERT) for intent classification and technical query understanding, benchmarked against a keyword-matching baseline</w:t>
-      </w:r>
-      <w:r>
-        <w:rPr>
-          <w:rFonts w:ascii="Calibri" w:cs="Calibri" w:eastAsia="Calibri" w:hAnsi="Calibri"/>
-          <w:sz w:val="21"/>
-          <w:szCs w:val="21"/>
+          <w:sz w:val="20"/>
+          <w:szCs w:val="20"/>
+        </w:rPr>
+        <w:t xml:space="preserve">Fine-tuned Hugging Face Transformers (BERT) for intent classification, benchmarked against a keyword-matching baseline</w:t>
+      </w:r>
+      <w:r>
+        <w:rPr>
+          <w:rFonts w:ascii="Calibri" w:cs="Calibri" w:eastAsia="Calibri" w:hAnsi="Calibri"/>
+          <w:sz w:val="20"/>
+          <w:szCs w:val="20"/>
         </w:rPr>
         <w:t xml:space="preserve">.</w:t>
       </w:r>
@@ -466,18 +420,28 @@
       <w:r>
         <w:rPr>
           <w:rFonts w:ascii="Calibri" w:cs="Calibri" w:eastAsia="Calibri" w:hAnsi="Calibri"/>
-          <w:sz w:val="21"/>
-          <w:szCs w:val="21"/>
-        </w:rPr>
-        <w:t xml:space="preserve">Tuned embedding and chunking strategy</w:t>
-      </w:r>
-      <w:r>
-        <w:rPr>
-          <w:rFonts w:ascii="Calibri" w:cs="Calibri" w:eastAsia="Calibri" w:hAnsi="Calibri"/>
-          <w:sz w:val="21"/>
-          <w:szCs w:val="21"/>
-        </w:rPr>
-        <w:t xml:space="preserve"> while managing vector embeddings in Pinecone and ChromaDB, improving retrieval relevance and cutting query latency.</w:t>
+          <w:sz w:val="20"/>
+          <w:szCs w:val="20"/>
+        </w:rPr>
+        <w:t xml:space="preserve">Built agentic workflows with </w:t>
+      </w:r>
+      <w:r>
+        <w:rPr>
+          <w:rFonts w:ascii="Calibri" w:cs="Calibri" w:eastAsia="Calibri" w:hAnsi="Calibri"/>
+          <w:b/>
+          <w:bCs/>
+          <w:sz w:val="20"/>
+          <w:szCs w:val="20"/>
+        </w:rPr>
+        <w:t xml:space="preserve">LangGraph and LlamaIndex</w:t>
+      </w:r>
+      <w:r>
+        <w:rPr>
+          <w:rFonts w:ascii="Calibri" w:cs="Calibri" w:eastAsia="Calibri" w:hAnsi="Calibri"/>
+          <w:sz w:val="20"/>
+          <w:szCs w:val="20"/>
+        </w:rPr>
+        <w:t xml:space="preserve"> to orchestrate retrieval, reasoning, and tool execution.</w:t>
       </w:r>
     </w:p>
     <w:p>
@@ -492,28 +456,36 @@
       <w:r>
         <w:rPr>
           <w:rFonts w:ascii="Calibri" w:cs="Calibri" w:eastAsia="Calibri" w:hAnsi="Calibri"/>
-          <w:sz w:val="21"/>
-          <w:szCs w:val="21"/>
-        </w:rPr>
-        <w:t xml:space="preserve">Implemented agentic workflows with </w:t>
-      </w:r>
-      <w:r>
-        <w:rPr>
-          <w:rFonts w:ascii="Calibri" w:cs="Calibri" w:eastAsia="Calibri" w:hAnsi="Calibri"/>
-          <w:b/>
-          <w:bCs/>
-          <w:sz w:val="21"/>
-          <w:szCs w:val="21"/>
-        </w:rPr>
-        <w:t xml:space="preserve">LangGraph and LlamaIndex</w:t>
-      </w:r>
-      <w:r>
-        <w:rPr>
-          <w:rFonts w:ascii="Calibri" w:cs="Calibri" w:eastAsia="Calibri" w:hAnsi="Calibri"/>
-          <w:sz w:val="21"/>
-          <w:szCs w:val="21"/>
-        </w:rPr>
-        <w:t xml:space="preserve"> to orchestrate retrieval, reasoning, and tool execution for complex support requests.</w:t>
+          <w:sz w:val="20"/>
+          <w:szCs w:val="20"/>
+        </w:rPr>
+        <w:t xml:space="preserve">Containerized AI services with Docker and deployed inference on </w:t>
+      </w:r>
+      <w:r>
+        <w:rPr>
+          <w:rFonts w:ascii="Calibri" w:cs="Calibri" w:eastAsia="Calibri" w:hAnsi="Calibri"/>
+          <w:b/>
+          <w:bCs/>
+          <w:sz w:val="20"/>
+          <w:szCs w:val="20"/>
+        </w:rPr>
+        <w:t xml:space="preserve">Kubernetes and AWS SageMaker</w:t>
+      </w:r>
+      <w:r>
+        <w:rPr>
+          <w:rFonts w:ascii="Calibri" w:cs="Calibri" w:eastAsia="Calibri" w:hAnsi="Calibri"/>
+          <w:sz w:val="20"/>
+          <w:szCs w:val="20"/>
+        </w:rPr>
+        <w:t xml:space="preserve">; automated training and versioning with GitHub Actions, CI/CD, and MLflow for drift-based retraining and monitoring</w:t>
+      </w:r>
+      <w:r>
+        <w:rPr>
+          <w:rFonts w:ascii="Calibri" w:cs="Calibri" w:eastAsia="Calibri" w:hAnsi="Calibri"/>
+          <w:sz w:val="20"/>
+          <w:szCs w:val="20"/>
+        </w:rPr>
+        <w:t xml:space="preserve">.</w:t>
       </w:r>
     </w:p>
     <w:p>
@@ -528,36 +500,47 @@
       <w:r>
         <w:rPr>
           <w:rFonts w:ascii="Calibri" w:cs="Calibri" w:eastAsia="Calibri" w:hAnsi="Calibri"/>
-          <w:sz w:val="21"/>
-          <w:szCs w:val="21"/>
-        </w:rPr>
-        <w:t xml:space="preserve">Containerized AI services with Docker and deployed inference on </w:t>
-      </w:r>
-      <w:r>
-        <w:rPr>
-          <w:rFonts w:ascii="Calibri" w:cs="Calibri" w:eastAsia="Calibri" w:hAnsi="Calibri"/>
-          <w:b/>
-          <w:bCs/>
-          <w:sz w:val="21"/>
-          <w:szCs w:val="21"/>
-        </w:rPr>
-        <w:t xml:space="preserve">Kubernetes and AWS SageMaker</w:t>
-      </w:r>
-      <w:r>
-        <w:rPr>
-          <w:rFonts w:ascii="Calibri" w:cs="Calibri" w:eastAsia="Calibri" w:hAnsi="Calibri"/>
-          <w:sz w:val="21"/>
-          <w:szCs w:val="21"/>
-        </w:rPr>
-        <w:t xml:space="preserve"> with autoscaling and health probes, replacing a manual release process</w:t>
-      </w:r>
-      <w:r>
-        <w:rPr>
-          <w:rFonts w:ascii="Calibri" w:cs="Calibri" w:eastAsia="Calibri" w:hAnsi="Calibri"/>
-          <w:sz w:val="21"/>
-          <w:szCs w:val="21"/>
-        </w:rPr>
-        <w:t xml:space="preserve">.</w:t>
+          <w:sz w:val="20"/>
+          <w:szCs w:val="20"/>
+        </w:rPr>
+        <w:t xml:space="preserve">Mentored junior engineers through code reviews; integrated AI features into enterprise apps with product and domain teams.</w:t>
+      </w:r>
+    </w:p>
+    <w:p>
+      <w:pPr>
+        <w:tabs>
+          <w:tab w:val="right" w:pos="10080"/>
+        </w:tabs>
+        <w:spacing w:after="20" w:before="100"/>
+      </w:pPr>
+      <w:r>
+        <w:rPr>
+          <w:rFonts w:ascii="Calibri" w:cs="Calibri" w:eastAsia="Calibri" w:hAnsi="Calibri"/>
+          <w:b/>
+          <w:bCs/>
+          <w:sz w:val="22"/>
+          <w:szCs w:val="22"/>
+        </w:rPr>
+        <w:t xml:space="preserve">Junior Machine Learning Engineer</w:t>
+      </w:r>
+      <w:r>
+        <w:rPr>
+          <w:rFonts w:ascii="Calibri" w:cs="Calibri" w:eastAsia="Calibri" w:hAnsi="Calibri"/>
+          <w:sz w:val="22"/>
+          <w:szCs w:val="22"/>
+        </w:rPr>
+        <w:t xml:space="preserve">  |  Colt Technology Services</w:t>
+      </w:r>
+      <w:r>
+        <w:rPr>
+          <w:rFonts w:ascii="Calibri" w:cs="Calibri" w:eastAsia="Calibri" w:hAnsi="Calibri"/>
+          <w:b/>
+          <w:bCs/>
+          <w:color w:val="595959"/>
+          <w:sz w:val="20"/>
+          <w:szCs w:val="20"/>
+        </w:rPr>
+        <w:t xml:space="preserve">	May 2021 – Jun 2023</w:t>
       </w:r>
     </w:p>
     <w:p>
@@ -572,28 +555,28 @@
       <w:r>
         <w:rPr>
           <w:rFonts w:ascii="Calibri" w:cs="Calibri" w:eastAsia="Calibri" w:hAnsi="Calibri"/>
-          <w:sz w:val="21"/>
-          <w:szCs w:val="21"/>
-        </w:rPr>
-        <w:t xml:space="preserve">Automated training, deployment, and versioning with </w:t>
-      </w:r>
-      <w:r>
-        <w:rPr>
-          <w:rFonts w:ascii="Calibri" w:cs="Calibri" w:eastAsia="Calibri" w:hAnsi="Calibri"/>
-          <w:b/>
-          <w:bCs/>
-          <w:sz w:val="21"/>
-          <w:szCs w:val="21"/>
-        </w:rPr>
-        <w:t xml:space="preserve">GitHub Actions, CI/CD, and MLflow</w:t>
-      </w:r>
-      <w:r>
-        <w:rPr>
-          <w:rFonts w:ascii="Calibri" w:cs="Calibri" w:eastAsia="Calibri" w:hAnsi="Calibri"/>
-          <w:sz w:val="21"/>
-          <w:szCs w:val="21"/>
-        </w:rPr>
-        <w:t xml:space="preserve">, enabling drift-based retraining and continuous monitoring.</w:t>
+          <w:sz w:val="20"/>
+          <w:szCs w:val="20"/>
+        </w:rPr>
+        <w:t xml:space="preserve">Built a </w:t>
+      </w:r>
+      <w:r>
+        <w:rPr>
+          <w:rFonts w:ascii="Calibri" w:cs="Calibri" w:eastAsia="Calibri" w:hAnsi="Calibri"/>
+          <w:b/>
+          <w:bCs/>
+          <w:sz w:val="20"/>
+          <w:szCs w:val="20"/>
+        </w:rPr>
+        <w:t xml:space="preserve">Customer Retention Intelligence &amp; Churn Prediction Platform</w:t>
+      </w:r>
+      <w:r>
+        <w:rPr>
+          <w:rFonts w:ascii="Calibri" w:cs="Calibri" w:eastAsia="Calibri" w:hAnsi="Calibri"/>
+          <w:sz w:val="20"/>
+          <w:szCs w:val="20"/>
+        </w:rPr>
+        <w:t xml:space="preserve"> to flag at-risk accounts for the retention team.</w:t>
       </w:r>
     </w:p>
     <w:p>
@@ -608,47 +591,36 @@
       <w:r>
         <w:rPr>
           <w:rFonts w:ascii="Calibri" w:cs="Calibri" w:eastAsia="Calibri" w:hAnsi="Calibri"/>
-          <w:sz w:val="21"/>
-          <w:szCs w:val="21"/>
-        </w:rPr>
-        <w:t xml:space="preserve">Mentored junior engineers through code reviews while integrating AI capabilities into enterprise applications with product and domain teams.</w:t>
-      </w:r>
-    </w:p>
-    <w:p>
-      <w:pPr>
-        <w:tabs>
-          <w:tab w:val="right" w:pos="10080"/>
-        </w:tabs>
-        <w:spacing w:after="20" w:before="100"/>
-      </w:pPr>
-      <w:r>
-        <w:rPr>
-          <w:rFonts w:ascii="Calibri" w:cs="Calibri" w:eastAsia="Calibri" w:hAnsi="Calibri"/>
-          <w:b/>
-          <w:bCs/>
-          <w:sz w:val="22"/>
-          <w:szCs w:val="22"/>
-        </w:rPr>
-        <w:t xml:space="preserve">Junior Machine Learning Engineer</w:t>
-      </w:r>
-      <w:r>
-        <w:rPr>
-          <w:rFonts w:ascii="Calibri" w:cs="Calibri" w:eastAsia="Calibri" w:hAnsi="Calibri"/>
-          <w:sz w:val="22"/>
-          <w:szCs w:val="22"/>
-        </w:rPr>
-        <w:t xml:space="preserve">  |  Colt Technology Services</w:t>
-      </w:r>
-      <w:r>
-        <w:rPr>
-          <w:rFonts w:ascii="Calibri" w:cs="Calibri" w:eastAsia="Calibri" w:hAnsi="Calibri"/>
-          <w:b/>
-          <w:bCs/>
-          <w:color w:val="595959"/>
-          <w:sz w:val="21"/>
-          <w:szCs w:val="21"/>
-        </w:rPr>
-        <w:t xml:space="preserve">	May 2021 – Jun 2023</w:t>
+          <w:sz w:val="20"/>
+          <w:szCs w:val="20"/>
+        </w:rPr>
+        <w:t xml:space="preserve">Cleaned and transformed </w:t>
+      </w:r>
+      <w:r>
+        <w:rPr>
+          <w:rFonts w:ascii="Calibri" w:cs="Calibri" w:eastAsia="Calibri" w:hAnsi="Calibri"/>
+          <w:b/>
+          <w:bCs/>
+          <w:sz w:val="20"/>
+          <w:szCs w:val="20"/>
+        </w:rPr>
+        <w:t xml:space="preserve">250K+ customer records</w:t>
+      </w:r>
+      <w:r>
+        <w:rPr>
+          <w:rFonts w:ascii="Calibri" w:cs="Calibri" w:eastAsia="Calibri" w:hAnsi="Calibri"/>
+          <w:sz w:val="20"/>
+          <w:szCs w:val="20"/>
+        </w:rPr>
+        <w:t xml:space="preserve"> with Pandas and NumPy; extended ETL pipelines unifying usage, billing, and support data into ML workflows</w:t>
+      </w:r>
+      <w:r>
+        <w:rPr>
+          <w:rFonts w:ascii="Calibri" w:cs="Calibri" w:eastAsia="Calibri" w:hAnsi="Calibri"/>
+          <w:sz w:val="20"/>
+          <w:szCs w:val="20"/>
+        </w:rPr>
+        <w:t xml:space="preserve">.</w:t>
       </w:r>
     </w:p>
     <w:p>
@@ -663,28 +635,36 @@
       <w:r>
         <w:rPr>
           <w:rFonts w:ascii="Calibri" w:cs="Calibri" w:eastAsia="Calibri" w:hAnsi="Calibri"/>
-          <w:sz w:val="21"/>
-          <w:szCs w:val="21"/>
-        </w:rPr>
-        <w:t xml:space="preserve">Developed a </w:t>
-      </w:r>
-      <w:r>
-        <w:rPr>
-          <w:rFonts w:ascii="Calibri" w:cs="Calibri" w:eastAsia="Calibri" w:hAnsi="Calibri"/>
-          <w:b/>
-          <w:bCs/>
-          <w:sz w:val="21"/>
-          <w:szCs w:val="21"/>
-        </w:rPr>
-        <w:t xml:space="preserve">Customer Retention Intelligence &amp; Churn Prediction Platform</w:t>
-      </w:r>
-      <w:r>
-        <w:rPr>
-          <w:rFonts w:ascii="Calibri" w:cs="Calibri" w:eastAsia="Calibri" w:hAnsi="Calibri"/>
-          <w:sz w:val="21"/>
-          <w:szCs w:val="21"/>
-        </w:rPr>
-        <w:t xml:space="preserve"> to identify at-risk customers and drive data-driven retention.</w:t>
+          <w:sz w:val="20"/>
+          <w:szCs w:val="20"/>
+        </w:rPr>
+        <w:t xml:space="preserve">Engineered features and built supervised models with </w:t>
+      </w:r>
+      <w:r>
+        <w:rPr>
+          <w:rFonts w:ascii="Calibri" w:cs="Calibri" w:eastAsia="Calibri" w:hAnsi="Calibri"/>
+          <w:b/>
+          <w:bCs/>
+          <w:sz w:val="20"/>
+          <w:szCs w:val="20"/>
+        </w:rPr>
+        <w:t xml:space="preserve">Scikit-learn and TensorFlow</w:t>
+      </w:r>
+      <w:r>
+        <w:rPr>
+          <w:rFonts w:ascii="Calibri" w:cs="Calibri" w:eastAsia="Calibri" w:hAnsi="Calibri"/>
+          <w:sz w:val="20"/>
+          <w:szCs w:val="20"/>
+        </w:rPr>
+        <w:t xml:space="preserve">, evaluated with cross-validation, precision/recall/F1, and confusion-matrix analysis against the incumbent rules-based model</w:t>
+      </w:r>
+      <w:r>
+        <w:rPr>
+          <w:rFonts w:ascii="Calibri" w:cs="Calibri" w:eastAsia="Calibri" w:hAnsi="Calibri"/>
+          <w:sz w:val="20"/>
+          <w:szCs w:val="20"/>
+        </w:rPr>
+        <w:t xml:space="preserve">.</w:t>
       </w:r>
     </w:p>
     <w:p>
@@ -699,132 +679,8 @@
       <w:r>
         <w:rPr>
           <w:rFonts w:ascii="Calibri" w:cs="Calibri" w:eastAsia="Calibri" w:hAnsi="Calibri"/>
-          <w:sz w:val="21"/>
-          <w:szCs w:val="21"/>
-        </w:rPr>
-        <w:t xml:space="preserve">Cleaned and transformed </w:t>
-      </w:r>
-      <w:r>
-        <w:rPr>
-          <w:rFonts w:ascii="Calibri" w:cs="Calibri" w:eastAsia="Calibri" w:hAnsi="Calibri"/>
-          <w:b/>
-          <w:bCs/>
-          <w:sz w:val="21"/>
-          <w:szCs w:val="21"/>
-        </w:rPr>
-        <w:t xml:space="preserve">250K+ customer records</w:t>
-      </w:r>
-      <w:r>
-        <w:rPr>
-          <w:rFonts w:ascii="Calibri" w:cs="Calibri" w:eastAsia="Calibri" w:hAnsi="Calibri"/>
-          <w:sz w:val="21"/>
-          <w:szCs w:val="21"/>
-        </w:rPr>
-        <w:t xml:space="preserve"> with Pandas and NumPy, improving data quality and automating a previously manual preprocessing step</w:t>
-      </w:r>
-      <w:r>
-        <w:rPr>
-          <w:rFonts w:ascii="Calibri" w:cs="Calibri" w:eastAsia="Calibri" w:hAnsi="Calibri"/>
-          <w:sz w:val="21"/>
-          <w:szCs w:val="21"/>
-        </w:rPr>
-        <w:t xml:space="preserve">.</w:t>
-      </w:r>
-    </w:p>
-    <w:p>
-      <w:pPr>
-        <w:pStyle w:val="ListParagraph"/>
-        <w:numPr>
-          <w:ilvl w:val="0"/>
-          <w:numId w:val="2"/>
-        </w:numPr>
-        <w:spacing w:after="30"/>
-      </w:pPr>
-      <w:r>
-        <w:rPr>
-          <w:rFonts w:ascii="Calibri" w:cs="Calibri" w:eastAsia="Calibri" w:hAnsi="Calibri"/>
-          <w:sz w:val="21"/>
-          <w:szCs w:val="21"/>
-        </w:rPr>
-        <w:t xml:space="preserve">Engineered features and built supervised models with </w:t>
-      </w:r>
-      <w:r>
-        <w:rPr>
-          <w:rFonts w:ascii="Calibri" w:cs="Calibri" w:eastAsia="Calibri" w:hAnsi="Calibri"/>
-          <w:b/>
-          <w:bCs/>
-          <w:sz w:val="21"/>
-          <w:szCs w:val="21"/>
-        </w:rPr>
-        <w:t xml:space="preserve">Scikit-learn and TensorFlow</w:t>
-      </w:r>
-      <w:r>
-        <w:rPr>
-          <w:rFonts w:ascii="Calibri" w:cs="Calibri" w:eastAsia="Calibri" w:hAnsi="Calibri"/>
-          <w:sz w:val="21"/>
-          <w:szCs w:val="21"/>
-        </w:rPr>
-        <w:t xml:space="preserve">, evaluated against the incumbent rules-based retention model</w:t>
-      </w:r>
-      <w:r>
-        <w:rPr>
-          <w:rFonts w:ascii="Calibri" w:cs="Calibri" w:eastAsia="Calibri" w:hAnsi="Calibri"/>
-          <w:sz w:val="21"/>
-          <w:szCs w:val="21"/>
-        </w:rPr>
-        <w:t xml:space="preserve">.</w:t>
-      </w:r>
-    </w:p>
-    <w:p>
-      <w:pPr>
-        <w:pStyle w:val="ListParagraph"/>
-        <w:numPr>
-          <w:ilvl w:val="0"/>
-          <w:numId w:val="2"/>
-        </w:numPr>
-        <w:spacing w:after="30"/>
-      </w:pPr>
-      <w:r>
-        <w:rPr>
-          <w:rFonts w:ascii="Calibri" w:cs="Calibri" w:eastAsia="Calibri" w:hAnsi="Calibri"/>
-          <w:sz w:val="21"/>
-          <w:szCs w:val="21"/>
-        </w:rPr>
-        <w:t xml:space="preserve">Improved ETL pipelines integrating usage, billing, and support data from multiple enterprise systems into ML workflows.</w:t>
-      </w:r>
-    </w:p>
-    <w:p>
-      <w:pPr>
-        <w:pStyle w:val="ListParagraph"/>
-        <w:numPr>
-          <w:ilvl w:val="0"/>
-          <w:numId w:val="2"/>
-        </w:numPr>
-        <w:spacing w:after="30"/>
-      </w:pPr>
-      <w:r>
-        <w:rPr>
-          <w:rFonts w:ascii="Calibri" w:cs="Calibri" w:eastAsia="Calibri" w:hAnsi="Calibri"/>
-          <w:sz w:val="21"/>
-          <w:szCs w:val="21"/>
-        </w:rPr>
-        <w:t xml:space="preserve">Optimized classifiers using cross-validation, precision/recall/F1, and confusion-matrix analysis to improve prediction reliability.</w:t>
-      </w:r>
-    </w:p>
-    <w:p>
-      <w:pPr>
-        <w:pStyle w:val="ListParagraph"/>
-        <w:numPr>
-          <w:ilvl w:val="0"/>
-          <w:numId w:val="2"/>
-        </w:numPr>
-        <w:spacing w:after="30"/>
-      </w:pPr>
-      <w:r>
-        <w:rPr>
-          <w:rFonts w:ascii="Calibri" w:cs="Calibri" w:eastAsia="Calibri" w:hAnsi="Calibri"/>
-          <w:sz w:val="21"/>
-          <w:szCs w:val="21"/>
+          <w:sz w:val="20"/>
+          <w:szCs w:val="20"/>
         </w:rPr>
         <w:t xml:space="preserve">Deployed models as </w:t>
       </w:r>
@@ -833,24 +689,24 @@
           <w:rFonts w:ascii="Calibri" w:cs="Calibri" w:eastAsia="Calibri" w:hAnsi="Calibri"/>
           <w:b/>
           <w:bCs/>
-          <w:sz w:val="21"/>
-          <w:szCs w:val="21"/>
+          <w:sz w:val="20"/>
+          <w:szCs w:val="20"/>
         </w:rPr>
         <w:t xml:space="preserve">FastAPI REST APIs on AWS</w:t>
       </w:r>
       <w:r>
         <w:rPr>
           <w:rFonts w:ascii="Calibri" w:cs="Calibri" w:eastAsia="Calibri" w:hAnsi="Calibri"/>
-          <w:sz w:val="21"/>
-          <w:szCs w:val="21"/>
+          <w:sz w:val="20"/>
+          <w:szCs w:val="20"/>
         </w:rPr>
         <w:t xml:space="preserve">, enabling real-time churn scoring in place of a nightly batch job</w:t>
       </w:r>
       <w:r>
         <w:rPr>
           <w:rFonts w:ascii="Calibri" w:cs="Calibri" w:eastAsia="Calibri" w:hAnsi="Calibri"/>
-          <w:sz w:val="21"/>
-          <w:szCs w:val="21"/>
+          <w:sz w:val="20"/>
+          <w:szCs w:val="20"/>
         </w:rPr>
         <w:t xml:space="preserve">.</w:t>
       </w:r>
@@ -889,16 +745,16 @@
           <w:rFonts w:ascii="Calibri" w:cs="Calibri" w:eastAsia="Calibri" w:hAnsi="Calibri"/>
           <w:b/>
           <w:bCs/>
-          <w:sz w:val="21"/>
-          <w:szCs w:val="21"/>
+          <w:sz w:val="20"/>
+          <w:szCs w:val="20"/>
         </w:rPr>
         <w:t xml:space="preserve">Enterprise AI Platform</w:t>
       </w:r>
       <w:r>
         <w:rPr>
           <w:rFonts w:ascii="Calibri" w:cs="Calibri" w:eastAsia="Calibri" w:hAnsi="Calibri"/>
-          <w:sz w:val="21"/>
-          <w:szCs w:val="21"/>
+          <w:sz w:val="20"/>
+          <w:szCs w:val="20"/>
         </w:rPr>
         <w:t xml:space="preserve">  —  </w:t>
       </w:r>
@@ -907,8 +763,8 @@
           <w:rPr>
             <w:rFonts w:ascii="Calibri" w:cs="Calibri" w:eastAsia="Calibri" w:hAnsi="Calibri"/>
             <w:color w:val="0563C1"/>
-            <w:sz w:val="21"/>
-            <w:szCs w:val="21"/>
+            <w:sz w:val="20"/>
+            <w:szCs w:val="20"/>
             <w:u w:val="single"/>
           </w:rPr>
           <w:t xml:space="preserve">github.com/saianthireddy/enterprise-ai-platform</w:t>
@@ -917,10 +773,10 @@
       <w:r>
         <w:rPr>
           <w:rFonts w:ascii="Calibri" w:cs="Calibri" w:eastAsia="Calibri" w:hAnsi="Calibri"/>
-          <w:sz w:val="21"/>
-          <w:szCs w:val="21"/>
-        </w:rPr>
-        <w:t xml:space="preserve">  —  Full-stack AI copilot: intent router over six task handlers, hybrid search, admin analytics, Next.js frontend, Terraform and Kubernetes infrastructure, 50 automated tests.</w:t>
+          <w:sz w:val="20"/>
+          <w:szCs w:val="20"/>
+        </w:rPr>
+        <w:t xml:space="preserve">  —  Intent router over six task handlers, hybrid search, admin analytics, Next.js, Terraform + Kubernetes.</w:t>
       </w:r>
     </w:p>
     <w:p>
@@ -937,16 +793,16 @@
           <w:rFonts w:ascii="Calibri" w:cs="Calibri" w:eastAsia="Calibri" w:hAnsi="Calibri"/>
           <w:b/>
           <w:bCs/>
-          <w:sz w:val="21"/>
-          <w:szCs w:val="21"/>
+          <w:sz w:val="20"/>
+          <w:szCs w:val="20"/>
         </w:rPr>
         <w:t xml:space="preserve">RAG Support Automation</w:t>
       </w:r>
       <w:r>
         <w:rPr>
           <w:rFonts w:ascii="Calibri" w:cs="Calibri" w:eastAsia="Calibri" w:hAnsi="Calibri"/>
-          <w:sz w:val="21"/>
-          <w:szCs w:val="21"/>
+          <w:sz w:val="20"/>
+          <w:szCs w:val="20"/>
         </w:rPr>
         <w:t xml:space="preserve">  —  </w:t>
       </w:r>
@@ -955,8 +811,8 @@
           <w:rPr>
             <w:rFonts w:ascii="Calibri" w:cs="Calibri" w:eastAsia="Calibri" w:hAnsi="Calibri"/>
             <w:color w:val="0563C1"/>
-            <w:sz w:val="21"/>
-            <w:szCs w:val="21"/>
+            <w:sz w:val="20"/>
+            <w:szCs w:val="20"/>
             <w:u w:val="single"/>
           </w:rPr>
           <w:t xml:space="preserve">github.com/saianthireddy/rag-support-automation</w:t>
@@ -965,10 +821,10 @@
       <w:r>
         <w:rPr>
           <w:rFonts w:ascii="Calibri" w:cs="Calibri" w:eastAsia="Calibri" w:hAnsi="Calibri"/>
-          <w:sz w:val="21"/>
-          <w:szCs w:val="21"/>
-        </w:rPr>
-        <w:t xml:space="preserve">  —  Production-style RAG platform: ingestion and chunking, swappable FAISS/Pinecone stores, citation-grounded generation, FastAPI, Docker, and a published retrieval benchmark.</w:t>
+          <w:sz w:val="20"/>
+          <w:szCs w:val="20"/>
+        </w:rPr>
+        <w:t xml:space="preserve">  —  Swappable FAISS/Pinecone stores, citation-grounded generation, FastAPI, and a published retrieval benchmark.</w:t>
       </w:r>
     </w:p>
     <w:p>
@@ -985,16 +841,16 @@
           <w:rFonts w:ascii="Calibri" w:cs="Calibri" w:eastAsia="Calibri" w:hAnsi="Calibri"/>
           <w:b/>
           <w:bCs/>
-          <w:sz w:val="21"/>
-          <w:szCs w:val="21"/>
+          <w:sz w:val="20"/>
+          <w:szCs w:val="20"/>
         </w:rPr>
         <w:t xml:space="preserve">Enterprise MLOps Platform</w:t>
       </w:r>
       <w:r>
         <w:rPr>
           <w:rFonts w:ascii="Calibri" w:cs="Calibri" w:eastAsia="Calibri" w:hAnsi="Calibri"/>
-          <w:sz w:val="21"/>
-          <w:szCs w:val="21"/>
+          <w:sz w:val="20"/>
+          <w:szCs w:val="20"/>
         </w:rPr>
         <w:t xml:space="preserve">  —  </w:t>
       </w:r>
@@ -1003,8 +859,8 @@
           <w:rPr>
             <w:rFonts w:ascii="Calibri" w:cs="Calibri" w:eastAsia="Calibri" w:hAnsi="Calibri"/>
             <w:color w:val="0563C1"/>
-            <w:sz w:val="21"/>
-            <w:szCs w:val="21"/>
+            <w:sz w:val="20"/>
+            <w:szCs w:val="20"/>
             <w:u w:val="single"/>
           </w:rPr>
           <w:t xml:space="preserve">github.com/saianthireddy/enterprise-mlops-platform</w:t>
@@ -1013,10 +869,10 @@
       <w:r>
         <w:rPr>
           <w:rFonts w:ascii="Calibri" w:cs="Calibri" w:eastAsia="Calibri" w:hAnsi="Calibri"/>
-          <w:sz w:val="21"/>
-          <w:szCs w:val="21"/>
-        </w:rPr>
-        <w:t xml:space="preserve">  —  Model lifecycle from commit to monitored endpoint: champion/challenger promotion, versioned registry, PSI/KS drift detection, Kubernetes and SageMaker deployment.</w:t>
+          <w:sz w:val="20"/>
+          <w:szCs w:val="20"/>
+        </w:rPr>
+        <w:t xml:space="preserve">  —  Champion/challenger promotion, versioned registry, PSI/KS drift detection, Kubernetes + SageMaker deploy.</w:t>
       </w:r>
     </w:p>
     <w:p>
@@ -1033,16 +889,16 @@
           <w:rFonts w:ascii="Calibri" w:cs="Calibri" w:eastAsia="Calibri" w:hAnsi="Calibri"/>
           <w:b/>
           <w:bCs/>
-          <w:sz w:val="21"/>
-          <w:szCs w:val="21"/>
+          <w:sz w:val="20"/>
+          <w:szCs w:val="20"/>
         </w:rPr>
         <w:t xml:space="preserve">webdocs-mcp</w:t>
       </w:r>
       <w:r>
         <w:rPr>
           <w:rFonts w:ascii="Calibri" w:cs="Calibri" w:eastAsia="Calibri" w:hAnsi="Calibri"/>
-          <w:sz w:val="21"/>
-          <w:szCs w:val="21"/>
+          <w:sz w:val="20"/>
+          <w:szCs w:val="20"/>
         </w:rPr>
         <w:t xml:space="preserve">  —  </w:t>
       </w:r>
@@ -1051,8 +907,8 @@
           <w:rPr>
             <w:rFonts w:ascii="Calibri" w:cs="Calibri" w:eastAsia="Calibri" w:hAnsi="Calibri"/>
             <w:color w:val="0563C1"/>
-            <w:sz w:val="21"/>
-            <w:szCs w:val="21"/>
+            <w:sz w:val="20"/>
+            <w:szCs w:val="20"/>
             <w:u w:val="single"/>
           </w:rPr>
           <w:t xml:space="preserve">github.com/saianthireddy/webdocs-mcp</w:t>
@@ -1061,10 +917,10 @@
       <w:r>
         <w:rPr>
           <w:rFonts w:ascii="Calibri" w:cs="Calibri" w:eastAsia="Calibri" w:hAnsi="Calibri"/>
-          <w:sz w:val="21"/>
-          <w:szCs w:val="21"/>
-        </w:rPr>
-        <w:t xml:space="preserve">  —  Documentation crawler with hybrid BM25 and embedding search over DuckDB, served to LLM agents as an MCP server.</w:t>
+          <w:sz w:val="20"/>
+          <w:szCs w:val="20"/>
+        </w:rPr>
+        <w:t xml:space="preserve">  —  Docs crawler with hybrid BM25 + embedding search over DuckDB, served to LLM agents as an MCP server.</w:t>
       </w:r>
     </w:p>
     <w:p>
@@ -1081,16 +937,16 @@
           <w:rFonts w:ascii="Calibri" w:cs="Calibri" w:eastAsia="Calibri" w:hAnsi="Calibri"/>
           <w:b/>
           <w:bCs/>
-          <w:sz w:val="21"/>
-          <w:szCs w:val="21"/>
+          <w:sz w:val="20"/>
+          <w:szCs w:val="20"/>
         </w:rPr>
         <w:t xml:space="preserve">Customer Churn Prediction</w:t>
       </w:r>
       <w:r>
         <w:rPr>
           <w:rFonts w:ascii="Calibri" w:cs="Calibri" w:eastAsia="Calibri" w:hAnsi="Calibri"/>
-          <w:sz w:val="21"/>
-          <w:szCs w:val="21"/>
+          <w:sz w:val="20"/>
+          <w:szCs w:val="20"/>
         </w:rPr>
         <w:t xml:space="preserve">  —  </w:t>
       </w:r>
@@ -1099,8 +955,8 @@
           <w:rPr>
             <w:rFonts w:ascii="Calibri" w:cs="Calibri" w:eastAsia="Calibri" w:hAnsi="Calibri"/>
             <w:color w:val="0563C1"/>
-            <w:sz w:val="21"/>
-            <w:szCs w:val="21"/>
+            <w:sz w:val="20"/>
+            <w:szCs w:val="20"/>
             <w:u w:val="single"/>
           </w:rPr>
           <w:t xml:space="preserve">github.com/saianthireddy/customer-churn-prediction</w:t>
@@ -1109,10 +965,10 @@
       <w:r>
         <w:rPr>
           <w:rFonts w:ascii="Calibri" w:cs="Calibri" w:eastAsia="Calibri" w:hAnsi="Calibri"/>
-          <w:sz w:val="21"/>
-          <w:szCs w:val="21"/>
-        </w:rPr>
-        <w:t xml:space="preserve">  —  End-to-end churn ML: data validation, feature engineering, Logistic Regression / Gradient Boosting pipelines, cross-validated evaluation, and a real-time /predict API with risk bands.</w:t>
+          <w:sz w:val="20"/>
+          <w:szCs w:val="20"/>
+        </w:rPr>
+        <w:t xml:space="preserve">  —  LogReg / Gradient Boosting pipelines, cross-validated evaluation, real-time /predict API with risk bands.</w:t>
       </w:r>
     </w:p>
     <w:p>
@@ -1132,14 +988,11 @@
           <w:sz w:val="23"/>
           <w:szCs w:val="23"/>
         </w:rPr>
-        <w:t xml:space="preserve">Education</w:t>
-      </w:r>
-    </w:p>
-    <w:p>
-      <w:pPr>
-        <w:tabs>
-          <w:tab w:val="right" w:pos="10080"/>
-        </w:tabs>
+        <w:t xml:space="preserve">Education &amp; Certification</w:t>
+      </w:r>
+    </w:p>
+    <w:p>
+      <w:pPr>
         <w:spacing w:after="20"/>
       </w:pPr>
       <w:r>
@@ -1147,107 +1000,60 @@
           <w:rFonts w:ascii="Calibri" w:cs="Calibri" w:eastAsia="Calibri" w:hAnsi="Calibri"/>
           <w:b/>
           <w:bCs/>
-          <w:sz w:val="21"/>
-          <w:szCs w:val="21"/>
-        </w:rPr>
-        <w:t xml:space="preserve">M.S. in Advanced Data Analytics</w:t>
-      </w:r>
-      <w:r>
-        <w:rPr>
-          <w:rFonts w:ascii="Calibri" w:cs="Calibri" w:eastAsia="Calibri" w:hAnsi="Calibri"/>
-          <w:sz w:val="21"/>
-          <w:szCs w:val="21"/>
-        </w:rPr>
-        <w:t xml:space="preserve">  |  University of North Texas, Denton, TX</w:t>
-      </w:r>
-      <w:r>
-        <w:rPr>
-          <w:rFonts w:ascii="Calibri" w:cs="Calibri" w:eastAsia="Calibri" w:hAnsi="Calibri"/>
-          <w:b/>
-          <w:bCs/>
-          <w:color w:val="595959"/>
-          <w:sz w:val="21"/>
-          <w:szCs w:val="21"/>
-        </w:rPr>
-        <w:t xml:space="preserve">	Aug 2023 – May 2025</w:t>
-      </w:r>
-    </w:p>
-    <w:p>
-      <w:pPr>
-        <w:tabs>
-          <w:tab w:val="right" w:pos="10080"/>
-        </w:tabs>
-        <w:spacing w:after="20"/>
-      </w:pPr>
-      <w:r>
-        <w:rPr>
-          <w:rFonts w:ascii="Calibri" w:cs="Calibri" w:eastAsia="Calibri" w:hAnsi="Calibri"/>
-          <w:b/>
-          <w:bCs/>
-          <w:sz w:val="21"/>
-          <w:szCs w:val="21"/>
-        </w:rPr>
-        <w:t xml:space="preserve">B.S. in Computer Science</w:t>
-      </w:r>
-      <w:r>
-        <w:rPr>
-          <w:rFonts w:ascii="Calibri" w:cs="Calibri" w:eastAsia="Calibri" w:hAnsi="Calibri"/>
-          <w:sz w:val="21"/>
-          <w:szCs w:val="21"/>
-        </w:rPr>
-        <w:t xml:space="preserve">  |  Osmania University, Hyderabad, India</w:t>
-      </w:r>
-      <w:r>
-        <w:rPr>
-          <w:rFonts w:ascii="Calibri" w:cs="Calibri" w:eastAsia="Calibri" w:hAnsi="Calibri"/>
-          <w:b/>
-          <w:bCs/>
-          <w:color w:val="595959"/>
-          <w:sz w:val="21"/>
-          <w:szCs w:val="21"/>
-        </w:rPr>
-        <w:t xml:space="preserve">	Jun 2018 – May 2021</w:t>
-      </w:r>
-    </w:p>
-    <w:p>
-      <w:pPr>
-        <w:pBdr>
-          <w:bottom w:val="single" w:color="1F4E79" w:sz="6"/>
-        </w:pBdr>
-        <w:spacing w:after="60" w:before="160"/>
-      </w:pPr>
-      <w:r>
-        <w:rPr>
-          <w:rFonts w:ascii="Calibri" w:cs="Calibri" w:eastAsia="Calibri" w:hAnsi="Calibri"/>
-          <w:b/>
-          <w:bCs/>
-          <w:caps/>
-          <w:color w:val="1F4E79"/>
-          <w:sz w:val="23"/>
-          <w:szCs w:val="23"/>
-        </w:rPr>
-        <w:t xml:space="preserve">Certification</w:t>
-      </w:r>
-    </w:p>
-    <w:p>
-      <w:pPr>
-        <w:spacing w:after="20"/>
-      </w:pPr>
-      <w:r>
-        <w:rPr>
-          <w:rFonts w:ascii="Calibri" w:cs="Calibri" w:eastAsia="Calibri" w:hAnsi="Calibri"/>
-          <w:b/>
-          <w:bCs/>
-          <w:sz w:val="21"/>
-          <w:szCs w:val="21"/>
+          <w:sz w:val="20"/>
+          <w:szCs w:val="20"/>
+        </w:rPr>
+        <w:t xml:space="preserve">M.S. Advanced Data Analytics</w:t>
+      </w:r>
+      <w:r>
+        <w:rPr>
+          <w:rFonts w:ascii="Calibri" w:cs="Calibri" w:eastAsia="Calibri" w:hAnsi="Calibri"/>
+          <w:sz w:val="20"/>
+          <w:szCs w:val="20"/>
+        </w:rPr>
+        <w:t xml:space="preserve">, University of North Texas (2025)    ·    </w:t>
+      </w:r>
+      <w:r>
+        <w:rPr>
+          <w:rFonts w:ascii="Calibri" w:cs="Calibri" w:eastAsia="Calibri" w:hAnsi="Calibri"/>
+          <w:b/>
+          <w:bCs/>
+          <w:sz w:val="20"/>
+          <w:szCs w:val="20"/>
+        </w:rPr>
+        <w:t xml:space="preserve">B.S. Computer Science</w:t>
+      </w:r>
+      <w:r>
+        <w:rPr>
+          <w:rFonts w:ascii="Calibri" w:cs="Calibri" w:eastAsia="Calibri" w:hAnsi="Calibri"/>
+          <w:sz w:val="20"/>
+          <w:szCs w:val="20"/>
+        </w:rPr>
+        <w:t xml:space="preserve">, Osmania University (2021)</w:t>
+      </w:r>
+      <w:r>
+        <w:rPr>
+          <w:rFonts w:ascii="Calibri" w:cs="Calibri" w:eastAsia="Calibri" w:hAnsi="Calibri"/>
+          <w:sz w:val="20"/>
+          <w:szCs w:val="20"/>
+        </w:rPr>
+        <w:t xml:space="preserve">    ·    </w:t>
+      </w:r>
+      <w:r>
+        <w:rPr>
+          <w:rFonts w:ascii="Calibri" w:cs="Calibri" w:eastAsia="Calibri" w:hAnsi="Calibri"/>
+          <w:b/>
+          <w:bCs/>
+          <w:sz w:val="20"/>
+          <w:szCs w:val="20"/>
         </w:rPr>
         <w:t xml:space="preserve">AWS Certified Solutions Architect – Associate</w:t>
       </w:r>
       <w:r>
         <w:rPr>
           <w:rFonts w:ascii="Calibri" w:cs="Calibri" w:eastAsia="Calibri" w:hAnsi="Calibri"/>
-          <w:sz w:val="21"/>
-          <w:szCs w:val="21"/>
+          <w:sz w:val="20"/>
+          <w:szCs w:val="20"/>
         </w:rPr>
         <w:t xml:space="preserve">  —  </w:t>
       </w:r>
@@ -1256,8 +1062,8 @@
           <w:rPr>
             <w:rFonts w:ascii="Calibri" w:cs="Calibri" w:eastAsia="Calibri" w:hAnsi="Calibri"/>
             <w:color w:val="0563C1"/>
-            <w:sz w:val="21"/>
-            <w:szCs w:val="21"/>
+            <w:sz w:val="20"/>
+            <w:szCs w:val="20"/>
             <w:u w:val="single"/>
           </w:rPr>
           <w:t xml:space="preserve">Verify on Credly</w:t>

</xml_diff>